<commit_message>
Merge Notebooks 04/07 into 03, add FailStep, baseline endpoint demo, relay updates, README/About page accuracy fixes, expanded sample messages, remove unused dataset copy
</commit_message>
<xml_diff>
--- a/assets/system architecture diagram/system_architecture_team03.docx
+++ b/assets/system architecture diagram/system_architecture_team03.docx
@@ -22,7 +22,7 @@
       <w:r>
         <w:drawing>
           <wp:inline distT="0" distB="0" distL="0" distR="0">
-            <wp:extent cx="5760720" cy="7269480"/>
+            <wp:extent cx="5760720" cy="8145512"/>
             <wp:effectExtent l="0" t="0" r="0" b="0"/>
             <wp:docPr id="2" name="System architecture diagram"/>
             <wp:cNvGraphicFramePr/>
@@ -33,9 +33,9 @@
                   <wpg:grpSpPr>
                     <a:xfrm>
                       <a:off x="0" y="0"/>
-                      <a:ext cx="5760720" cy="7269480"/>
+                      <a:ext cx="5760720" cy="8145512"/>
                       <a:chOff x="0" y="0"/>
-                      <a:chExt cx="5760720" cy="7269480"/>
+                      <a:chExt cx="5760720" cy="8145512"/>
                     </a:xfrm>
                   </wpg:grpSpPr>
                   <wps:wsp>
@@ -670,11 +670,194 @@
                     </wps:bodyPr>
                   </wps:wsp>
                   <wps:wsp>
+                    <wps:cNvPr id="60" name="FastAPI relay + ngrok tunnel"/>
+                    <wps:cNvSpPr txBox="1"/>
+                    <wps:spPr>
+                      <a:xfrm>
+                        <a:off x="1481328" y="6547104"/>
+                        <a:ext cx="2798064" cy="620000"/>
+                      </a:xfrm>
+                      <a:prstGeom prst="roundRect">
+                        <a:avLst>
+                          <a:gd name="adj" fmla="val 12000"/>
+                        </a:avLst>
+                      </a:prstGeom>
+                      <a:solidFill>
+                        <a:srgbClr val="D9F0EC"/>
+                      </a:solidFill>
+                      <a:ln w="9525">
+                        <a:solidFill>
+                          <a:srgbClr val="2F7A68"/>
+                        </a:solidFill>
+                        <a:prstDash val="dash"/>
+                      </a:ln>
+                    </wps:spPr>
+                    <wps:txbx>
+                      <w:txbxContent>
+                        <w:p>
+                          <w:pPr>
+                            <w:spacing w:before="0" w:after="0" w:line="216" w:lineRule="auto"/>
+                            <w:jc w:val="center"/>
+                            <w:rPr>
+                              <w:rFonts w:ascii="Times New Roman" w:hAnsi="Times New Roman"/>
+                              <w:sz w:val="16"/>
+                            </w:rPr>
+                          </w:pPr>
+                          <w:r>
+                            <w:rPr>
+                              <w:rFonts w:ascii="Times New Roman" w:hAnsi="Times New Roman"/>
+                              <w:color w:val="1A1A1A"/>
+                              <w:sz w:val="16"/>
+                            </w:rPr>
+                            <w:t xml:space="preserve">FastAPI relay + ngrok tunnel  (Notebook 06)</w:t>
+                          </w:r>
+                        </w:p>
+                        <w:p>
+                          <w:pPr>
+                            <w:spacing w:before="0" w:after="0" w:line="216" w:lineRule="auto"/>
+                            <w:jc w:val="center"/>
+                            <w:rPr>
+                              <w:rFonts w:ascii="Times New Roman" w:hAnsi="Times New Roman"/>
+                              <w:sz w:val="16"/>
+                            </w:rPr>
+                          </w:pPr>
+                          <w:r>
+                            <w:rPr>
+                              <w:rFonts w:ascii="Times New Roman" w:hAnsi="Times New Roman"/>
+                              <w:color w:val="1A1A1A"/>
+                              <w:sz w:val="16"/>
+                            </w:rPr>
+                            <w:t xml:space="preserve">runs in SageMaker Studio, uses the execution role  ·  POST /predict</w:t>
+                          </w:r>
+                        </w:p>
+                        <w:p>
+                          <w:pPr>
+                            <w:spacing w:before="0" w:after="0" w:line="216" w:lineRule="auto"/>
+                            <w:jc w:val="center"/>
+                            <w:rPr>
+                              <w:rFonts w:ascii="Times New Roman" w:hAnsi="Times New Roman"/>
+                              <w:sz w:val="16"/>
+                            </w:rPr>
+                          </w:pPr>
+                          <w:r>
+                            <w:rPr>
+                              <w:rFonts w:ascii="Times New Roman" w:hAnsi="Times New Roman"/>
+                              <w:color w:val="1A1A1A"/>
+                              <w:sz w:val="16"/>
+                            </w:rPr>
+                            <w:t xml:space="preserve">temporary demo mechanism — restart before each session</w:t>
+                          </w:r>
+                        </w:p>
+                      </w:txbxContent>
+                    </wps:txbx>
+                    <wps:bodyPr rot="0" vert="horz" wrap="square" lIns="45720" tIns="27432" rIns="45720" bIns="27432" anchor="ctr" anchorCtr="0">
+                      <a:noAutofit/>
+                    </wps:bodyPr>
+                  </wps:wsp>
+                  <wps:wsp>
+                    <wps:cNvPr id="61" name="connector 62"/>
+                    <wps:cNvCnPr/>
+                    <wps:spPr>
+                      <a:xfrm>
+                        <a:off x="2880360" y="7167104"/>
+                        <a:ext cx="91" cy="256032"/>
+                      </a:xfrm>
+                      <a:prstGeom prst="straightConnector1">
+                        <a:avLst/>
+                      </a:prstGeom>
+                      <a:ln w="9525">
+                        <a:solidFill>
+                          <a:srgbClr val="4A4A4A"/>
+                        </a:solidFill>
+                        <a:tailEnd type="triangle" w="med" len="med"/>
+                      </a:ln>
+                    </wps:spPr>
+                    <wps:bodyPr/>
+                  </wps:wsp>
+                  <wps:wsp>
+                    <wps:cNvPr id="63" name="label no AWS credentials"/>
+                    <wps:cNvSpPr txBox="1"/>
+                    <wps:spPr>
+                      <a:xfrm>
+                        <a:off x="0" y="6601968"/>
+                        <a:ext cx="1389888" cy="457200"/>
+                      </a:xfrm>
+                      <a:prstGeom prst="rect">
+                        <a:avLst/>
+                      </a:prstGeom>
+                      <a:noFill/>
+                      <a:ln>
+                        <a:noFill/>
+                      </a:ln>
+                    </wps:spPr>
+                    <wps:txbx>
+                      <w:txbxContent>
+                        <w:p>
+                          <w:pPr>
+                            <w:spacing w:before="0" w:after="0" w:line="216" w:lineRule="auto"/>
+                            <w:jc w:val="center"/>
+                            <w:rPr>
+                              <w:rFonts w:ascii="Times New Roman" w:hAnsi="Times New Roman"/>
+                              <w:sz w:val="14"/>
+                            </w:rPr>
+                          </w:pPr>
+                          <w:r>
+                            <w:rPr>
+                              <w:rFonts w:ascii="Times New Roman" w:hAnsi="Times New Roman"/>
+                              <w:color w:val="1A1A1A"/>
+                              <w:sz w:val="14"/>
+                            </w:rPr>
+                            <w:t xml:space="preserve">relay URL + API key</w:t>
+                          </w:r>
+                        </w:p>
+                        <w:p>
+                          <w:pPr>
+                            <w:spacing w:before="0" w:after="0" w:line="216" w:lineRule="auto"/>
+                            <w:jc w:val="center"/>
+                            <w:rPr>
+                              <w:rFonts w:ascii="Times New Roman" w:hAnsi="Times New Roman"/>
+                              <w:sz w:val="14"/>
+                            </w:rPr>
+                          </w:pPr>
+                          <w:r>
+                            <w:rPr>
+                              <w:rFonts w:ascii="Times New Roman" w:hAnsi="Times New Roman"/>
+                              <w:color w:val="1A1A1A"/>
+                              <w:sz w:val="14"/>
+                            </w:rPr>
+                            <w:t xml:space="preserve">entered at runtime —</w:t>
+                          </w:r>
+                        </w:p>
+                        <w:p>
+                          <w:pPr>
+                            <w:spacing w:before="0" w:after="0" w:line="216" w:lineRule="auto"/>
+                            <w:jc w:val="center"/>
+                            <w:rPr>
+                              <w:rFonts w:ascii="Times New Roman" w:hAnsi="Times New Roman"/>
+                              <w:sz w:val="14"/>
+                            </w:rPr>
+                          </w:pPr>
+                          <w:r>
+                            <w:rPr>
+                              <w:rFonts w:ascii="Times New Roman" w:hAnsi="Times New Roman"/>
+                              <w:color w:val="1A1A1A"/>
+                              <w:sz w:val="14"/>
+                            </w:rPr>
+                            <w:t xml:space="preserve">no AWS credentials</w:t>
+                          </w:r>
+                        </w:p>
+                      </w:txbxContent>
+                    </wps:txbx>
+                    <wps:bodyPr rot="0" vert="horz" wrap="square" lIns="45720" tIns="27432" rIns="45720" bIns="27432" anchor="ctr" anchorCtr="0">
+                      <a:noAutofit/>
+                    </wps:bodyPr>
+                  </wps:wsp>
+                  <wps:wsp>
                     <wps:cNvPr id="22" name="Streamlit client  (app.py)"/>
                     <wps:cNvSpPr txBox="1"/>
                     <wps:spPr>
                       <a:xfrm>
-                        <a:off x="1481328" y="6547104"/>
+                        <a:off x="1481328" y="7423136"/>
                         <a:ext cx="2798064" cy="512064"/>
                       </a:xfrm>
                       <a:prstGeom prst="roundRect">
@@ -1162,7 +1345,6 @@
                         <a:solidFill>
                           <a:srgbClr val="4A4A4A"/>
                         </a:solidFill>
-                        <a:prstDash val="dash"/>
                         <a:tailEnd type="triangle" w="med" len="med"/>
                       </a:ln>
                     </wps:spPr>
@@ -1467,7 +1649,7 @@
                     </wps:bodyPr>
                   </wps:wsp>
                   <wps:wsp>
-                    <wps:cNvPr id="55" name="label integration pending"/>
+                    <wps:cNvPr id="55" name="label verified live"/>
                     <wps:cNvSpPr txBox="1"/>
                     <wps:spPr>
                       <a:xfrm>
@@ -1499,7 +1681,7 @@
                               <w:color w:val="1A1A1A"/>
                               <w:sz w:val="14"/>
                             </w:rPr>
-                            <w:t xml:space="preserve">integration pending</w:t>
+                            <w:t xml:space="preserve">verified live · 19 Aug 2026</w:t>
                           </w:r>
                         </w:p>
                       </w:txbxContent>
@@ -1746,7 +1928,7 @@
           <w:i/>
           <w:sz w:val="18"/>
         </w:rPr>
-        <w:t>Training and retraining run on AWS. The dashed arrow marks the one path not yet fully automated: the Streamlit client still returns placeholder values pending endpoint integration. (The S3 retraining trigger is also a proof-of-concept polling loop from a notebook rather than an event-driven service, but is not shown as a separate arrow above.)</w:t>
+        <w:t>Training and retraining run on AWS. The Streamlit client reaches the endpoint through a temporary FastAPI + ngrok relay (Notebook 06) rather than calling it directly, so the client never holds AWS credentials. Verified end-to-end 19 Aug 2026. (The S3 retraining trigger is a proof-of-concept polling loop from a notebook rather than an event-driven service, and the relay is likewise a temporary demo mechanism rather than a production access path — see Section 13.)</w:t>
       </w:r>
     </w:p>
     <w:sectPr>

</xml_diff>